<commit_message>
Public Report: enrich 2.1 with design-choice rationale (PDF + DOCX)
Adds the conceptual rationale for the key choices (weekly/Friday rebalance,
3-day forecast vs weekly holding, 8% emergency, long-only, confidence sizing,
conservative regime multipliers) to the Applied Rationale section.

Co-Authored-By: Claude Opus 4.8 (1M context) <noreply@anthropic.com>
</commit_message>
<xml_diff>
--- a/Public Report G101 M16.docx
+++ b/Public Report G101 M16.docx
@@ -770,6 +770,21 @@
     <w:p>
       <w:pPr>
         <w:spacing w:line="360" w:lineRule="auto"/>
+        <w:jc w:val="both"/>
+      </w:pPr>
+      <w:r>
+        <w:rPr>
+          <w:rFonts w:ascii="Arial" w:hAnsi="Arial"/>
+          <w:b w:val="0"/>
+          <w:i w:val="0"/>
+          <w:sz w:val="24"/>
+        </w:rPr>
+        <w:t>Design-choice rationale. The key operating parameters follow from principles, not parameter sweeps. The portfolio rebalances weekly because the decision frequency should match the rate at which the underlying signals (macro liquidity, on-chain data, trend regime) actually evolve - daily rebalancing would trade on noise and pay cost, while monthly would be too slow for crypto's fast regime shifts; rebalancing on Friday concentrates a full week of information into one auditable decision and makes weekend exposure (crypto trades 24/7) a deliberate choice. The model forecasts a short, three-day horizon - where return predictability is strongest - but holds the position through the week, because no materially better information arrives intra-week to justify the cost of trading; an emergency rebalance overrides this only on rare, regime-defining single-day moves (fat-tail events that are signal, not the noise the weekly cadence absorbs). The strategy is long-only because shorting a positively-drifting, fat-right-tailed asset is asymmetrically risky; positions are sized by model confidence (a fractional-Kelly intuition); and the regime multipliers are deliberately conservative, trading some backtest return for robustness to prediction and regime-classification error in live operation.</w:t>
+      </w:r>
+    </w:p>
+    <w:p>
+      <w:pPr>
+        <w:spacing w:line="360" w:lineRule="auto"/>
         <w:jc w:val="left"/>
       </w:pPr>
       <w:r>

</xml_diff>

<commit_message>
Public Report: restate results in consistent BRL under final M1 config
Headline now in consistent BRL (BTC priced via USDBRL): Sortino_d 3.84,
max DD -5.3%, CAGR +50.5% (10-seed means); BRL benchmarks updated; 2026
YTD +9.3% vs BTC -33% (BRL); accuracy de-risk retired after 10-seed
validation; emergency executed post-close. MD + PDF + DOCX regenerated.

Co-Authored-By: Claude Fable 5 <noreply@anthropic.com>
</commit_message>
<xml_diff>
--- a/Public Report G101 M16.docx
+++ b/Public Report G101 M16.docx
@@ -424,7 +424,7 @@
           <w:i w:val="0"/>
           <w:sz w:val="24"/>
         </w:rPr>
-        <w:t>Investidores institucionais brasileiros enfrentam um dilema ao buscar exposição a Bitcoin (BTC): o ativo oferece prêmio de risco no longo prazo, mas com quedas (drawdowns) de 60% a 80% que são incompatíveis com a maioria dos mandatos. Este trabalho, desenvolvido com a gestora de criptoativos Hashdex, apresenta uma solução de aprendizado de máquina que decide semanalmente qual fração de uma carteira manter em BTC versus um indexador de caixa (o CDI), de forma long-only (0% a 100%, sem venda a descoberto) e otimizada para retorno ajustado ao risco de queda (Sortino). O núcleo é um ensemble duplo de árvores de decisão com gradient boosting (XGBoost) que prevê o retorno do BTC em três dias; a previsão é convertida em uma alocação dimensionada por um filtro de regime de mercado e pela confiança do modelo, e limitada por controles de risco automáticos. A validação seguiu práticas de finanças quantitativas: walk-forward out-of-sample com purga temporal, teste de permutação de rótulos, Sharpe deflacionado e validação com múltiplas sementes. Em um backtest de 4,28 anos out-of-sample, a estratégia obteve Sortino diário de 3,53 e drawdown máximo de -7,1%, contra -21,7% de uma alocação estática 30% BTC/70% CDI e -66,7% de uma posição comprada em BTC. O sinal é estatisticamente real (nenhuma de 100 permutações superou o baseline; p &lt; 0,01). A solução encontra-se em fase de paper trade, com um gate de decisão de capital previsto para o terceiro trimestre de 2026.</w:t>
+        <w:t>Investidores institucionais brasileiros enfrentam um dilema ao buscar exposição a Bitcoin (BTC): o ativo oferece prêmio de risco no longo prazo, mas com quedas (drawdowns) de 60% a 80% que são incompatíveis com a maioria dos mandatos. Este trabalho, desenvolvido com a gestora de criptoativos Hashdex, apresenta uma solução de aprendizado de máquina que decide semanalmente qual fração de uma carteira manter em BTC versus um indexador de caixa (o CDI), de forma long-only (0% a 100%, sem venda a descoberto) e otimizada para retorno ajustado ao risco de queda (Sortino). O núcleo é um ensemble duplo de árvores de decisão com gradient boosting (XGBoost) que prevê o retorno do BTC em três dias; a previsão é convertida em uma alocação dimensionada por um filtro de regime de mercado e pela confiança do modelo, e limitada por controles de risco automáticos. A validação seguiu práticas de finanças quantitativas: walk-forward out-of-sample com purga temporal, teste de permutação de rótulos, Sharpe deflacionado e validação com múltiplas sementes. Em um backtest de 4,28 anos out-of-sample, medido integralmente em reais (BTC convertido por USDBRL), a estratégia obteve Sortino diário de 3,84 e drawdown máximo de -5,3%, contra -20,2% de uma alocação estática 30% BTC/70% CDI e -66,5% de uma posição comprada em BTC. O sinal é estatisticamente real (nenhuma de 100 permutações superou o baseline; p &lt; 0,01). A solução encontra-se em fase de paper trade, com um gate de decisão de capital previsto para o terceiro trimestre de 2026.</w:t>
       </w:r>
     </w:p>
     <w:p>
@@ -474,7 +474,7 @@
           <w:i w:val="0"/>
           <w:sz w:val="24"/>
         </w:rPr>
-        <w:t>Brazilian institutional investors face a dilemma when seeking Bitcoin (BTC) exposure: the asset offers a long-run risk premium but with 60%-80% drawdowns that are incompatible with most mandates. This project, developed with the crypto asset manager Hashdex, presents a machine-learning solution that decides weekly what fraction of a portfolio to hold in BTC versus a cash benchmark (the Brazilian interbank rate, CDI), in a long-only manner (0% to 100%, no short selling) and optimized for downside risk-adjusted return (the Sortino ratio). The core is a dual ensemble of gradient-boosted decision trees (XGBoost) that forecasts the three-day forward BTC return; the forecast is converted into an allocation scaled by a market-regime filter and the model's confidence, and bounded by automated risk controls. Validation followed quantitative-finance best practice: walk-forward out-of-sample testing with temporal purging, label permutation testing, the Deflated Sharpe Ratio, and multi-seed validation. In a 4.28-year out-of-sample backtest the strategy achieved a daily Sortino ratio of 3.53 and a maximum drawdown of -7.1%, versus -21.7% for a static 30% BTC / 70% CDI allocation and -66.7% for a buy-and-hold BTC position. The signal is statistically real (none of 100 label permutations beat the baseline; p &lt; 0.01). The solution is in a paper-trading phase, with a capital-allocation decision gate planned for the third quarter of 2026.</w:t>
+        <w:t>Brazilian institutional investors face a dilemma when seeking Bitcoin (BTC) exposure: the asset offers a long-run risk premium but with 60%-80% drawdowns that are incompatible with most mandates. This project, developed with the crypto asset manager Hashdex, presents a machine-learning solution that decides weekly what fraction of a portfolio to hold in BTC versus a cash benchmark (the Brazilian interbank rate, CDI), in a long-only manner (0% to 100%, no short selling) and optimized for downside risk-adjusted return (the Sortino ratio). The core is a dual ensemble of gradient-boosted decision trees (XGBoost) that forecasts the three-day forward BTC return; the forecast is converted into an allocation scaled by a market-regime filter and the model's confidence, and bounded by automated risk controls. Validation followed quantitative-finance best practice: walk-forward out-of-sample testing with temporal purging, label permutation testing, the Deflated Sharpe Ratio, and multi-seed validation. In a 4.28-year out-of-sample backtest, measured fully in Brazilian reais (BTC converted at USDBRL), the strategy achieved a daily Sortino ratio of 3.84 and a maximum drawdown of -5.3%, versus -20.2% for a static 30% BTC / 70% CDI allocation and -66.5% for a buy-and-hold BTC position. The signal is statistically real (none of 100 label permutations beat the baseline; p &lt; 0.01). The solution is in a paper-trading phase, with a capital-allocation decision gate planned for the third quarter of 2026.</w:t>
       </w:r>
     </w:p>
     <w:p>
@@ -599,7 +599,7 @@
           <w:i w:val="0"/>
           <w:sz w:val="24"/>
         </w:rPr>
-        <w:t>The core problem is to capture Bitcoin's risk premium with a fraction of its drawdown, systematically. The baseline (the current alternative) is a static allocation. Over the 2022-2026 test window, in BRL: a 100% BTC buy-and-hold position returned +15.5% CAGR but suffered a -66.7% maximum drawdown; a static 30% BTC / 70% CDI blend returned +17.0% CAGR with a -21.7% drawdown and a Sortino ratio of 1.13; cash (CDI) returned +13.0% with no drawdown. The opportunity is to dominate these baselines on a downside-risk-adjusted basis.</w:t>
+        <w:t>The core problem is to capture Bitcoin's risk premium with a fraction of its drawdown, systematically. The baseline (the current alternative) is a static allocation. Over the 2022-2026 test window, in consistent BRL (BTC priced via USDBRL): a 100% BTC buy-and-hold position returned +12.1% CAGR but suffered a -66.5% maximum drawdown; a static 30% BTC / 70% CDI blend returned +15.6% CAGR with a -20.2% drawdown and a Sortino ratio of 1.03; cash (CDI) returned +12.8% with no drawdown. The opportunity is to dominate these baselines on a downside-risk-adjusted basis.</w:t>
       </w:r>
     </w:p>
     <w:p>
@@ -779,7 +779,7 @@
           <w:i w:val="0"/>
           <w:sz w:val="24"/>
         </w:rPr>
-        <w:t>Design-choice rationale. The key operating parameters follow from principles, not parameter sweeps. The portfolio rebalances weekly because the decision frequency should match the rate at which the underlying signals (macro liquidity, on-chain data, trend regime) actually evolve - daily rebalancing would trade on noise and pay cost, while monthly would be too slow for crypto's fast regime shifts; rebalancing on Friday concentrates a full week of information into one auditable decision and makes weekend exposure (crypto trades 24/7) a deliberate choice. The model forecasts a short, three-day horizon - where return predictability is strongest - but holds the position through the week, because no materially better information arrives intra-week to justify the cost of trading; an emergency rebalance overrides this only on rare, regime-defining single-day moves (fat-tail events that are signal, not the noise the weekly cadence absorbs). The strategy is long-only because shorting a positively-drifting, fat-right-tailed asset is asymmetrically risky; positions are sized by model confidence (a fractional-Kelly intuition); and the regime multipliers are deliberately conservative, trading some backtest return for robustness to prediction and regime-classification error in live operation.</w:t>
+        <w:t>Design-choice rationale. The key operating parameters follow from principles, not parameter sweeps. The portfolio rebalances weekly because the decision frequency should match the rate at which the underlying signals (macro liquidity, on-chain data, trend regime) actually evolve - daily rebalancing would trade on noise and pay cost, while monthly would be too slow for crypto's fast regime shifts; rebalancing on Friday concentrates a full week of information into one auditable decision and makes weekend exposure (crypto trades 24/7) a deliberate choice. The model forecasts a short, three-day horizon - where return predictability is strongest - but holds the position through the week, because no materially better information arrives intra-week to justify the cost of trading; an emergency rebalance overrides this only on rare, regime-defining single-day moves (fat-tail events that are signal, not the noise the weekly cadence absorbs), detected and executed right after the daily candle close - waiting for the close, rather than trading intraday at the trigger level, historically buys the dip at better prices. The strategy is long-only because shorting a positively-drifting, fat-right-tailed asset is asymmetrically risky; positions are sized by model confidence (a fractional-Kelly intuition); and the regime multipliers are deliberately conservative, trading some backtest return for robustness to prediction and regime-classification error in live operation.</w:t>
       </w:r>
     </w:p>
     <w:p>
@@ -839,7 +839,7 @@
           <w:i w:val="0"/>
           <w:sz w:val="24"/>
         </w:rPr>
-        <w:t>Risk controls. Three automated controls are part of the production code: a kill switch that caps exposure on excessive drawdown; an accuracy de-risk that halves exposure when rolling accuracy deteriorates while the model is overconfident; and a population-stability monitor for feature drift.</w:t>
+        <w:t>Risk controls. Two automated controls are part of the production code: a kill switch that caps exposure on excessive drawdown, and a population-stability monitor for feature drift. An accuracy de-risk rule (halving exposure when rolling accuracy deteriorated) was part of the original design but was retired in June 2026 after a 10-seed paired validation showed it reduced return without reducing maximum drawdown; rolling accuracy is still reported for monitoring.</w:t>
       </w:r>
     </w:p>
     <w:p>
@@ -854,7 +854,7 @@
           <w:i w:val="0"/>
           <w:sz w:val="24"/>
         </w:rPr>
-        <w:t>Validation. The system is evaluated with walk-forward out-of-sample testing (expanding window, temporal purge/embargo), multi-seed runs, label-permutation testing, and the Deflated Sharpe Ratio. Engineering practices include pinned dependencies for reproducibility, a configuration fingerprint that forces retraining of a stale model, and a suite of 132 automated tests, run on every change by a continuous-integration workflow.</w:t>
+        <w:t>Validation. The system is evaluated with walk-forward out-of-sample testing (expanding window, temporal purge/embargo), multi-seed runs, label-permutation testing, and the Deflated Sharpe Ratio. Engineering practices include pinned dependencies for reproducibility, a configuration fingerprint that forces retraining of a stale model, and a suite of 133 automated tests, run on every change by a continuous-integration workflow.</w:t>
       </w:r>
     </w:p>
     <w:p>
@@ -899,7 +899,7 @@
           <w:i w:val="0"/>
           <w:sz w:val="24"/>
         </w:rPr>
-        <w:t>Table 1 - Risk-adjusted performance (4.28-year out-of-sample backtest, BRL).</w:t>
+        <w:t>Table 1 - Risk-adjusted performance (4.28-year out-of-sample backtest, consistent BRL: BTC priced via USDBRL, cash leg at CDI; 10-seed means).</w:t>
       </w:r>
     </w:p>
     <w:tbl>
@@ -1007,7 +1007,7 @@
                 <w:rFonts w:ascii="Arial" w:hAnsi="Arial"/>
                 <w:sz w:val="22"/>
               </w:rPr>
-              <w:t>+13.0%</w:t>
+              <w:t>+12.8%</w:t>
             </w:r>
           </w:p>
         </w:tc>
@@ -1069,7 +1069,7 @@
                 <w:rFonts w:ascii="Arial" w:hAnsi="Arial"/>
                 <w:sz w:val="22"/>
               </w:rPr>
-              <w:t>+17.0%</w:t>
+              <w:t>+15.6%</w:t>
             </w:r>
           </w:p>
         </w:tc>
@@ -1084,7 +1084,7 @@
                 <w:rFonts w:ascii="Arial" w:hAnsi="Arial"/>
                 <w:sz w:val="22"/>
               </w:rPr>
-              <w:t>1.13</w:t>
+              <w:t>1.03</w:t>
             </w:r>
           </w:p>
         </w:tc>
@@ -1099,7 +1099,7 @@
                 <w:rFonts w:ascii="Arial" w:hAnsi="Arial"/>
                 <w:sz w:val="22"/>
               </w:rPr>
-              <w:t>-21.7%</w:t>
+              <w:t>-20.2%</w:t>
             </w:r>
           </w:p>
         </w:tc>
@@ -1131,7 +1131,7 @@
                 <w:rFonts w:ascii="Arial" w:hAnsi="Arial"/>
                 <w:sz w:val="22"/>
               </w:rPr>
-              <w:t>+15.5%</w:t>
+              <w:t>+12.1%</w:t>
             </w:r>
           </w:p>
         </w:tc>
@@ -1146,7 +1146,7 @@
                 <w:rFonts w:ascii="Arial" w:hAnsi="Arial"/>
                 <w:sz w:val="22"/>
               </w:rPr>
-              <w:t>0.56</w:t>
+              <w:t>0.50</w:t>
             </w:r>
           </w:p>
         </w:tc>
@@ -1161,7 +1161,7 @@
                 <w:rFonts w:ascii="Arial" w:hAnsi="Arial"/>
                 <w:sz w:val="22"/>
               </w:rPr>
-              <w:t>-66.7%</w:t>
+              <w:t>-66.5%</w:t>
             </w:r>
           </w:p>
         </w:tc>
@@ -1195,7 +1195,7 @@
                 <w:b/>
                 <w:sz w:val="22"/>
               </w:rPr>
-              <w:t>+57.3%</w:t>
+              <w:t>+50.5%</w:t>
             </w:r>
           </w:p>
         </w:tc>
@@ -1211,7 +1211,7 @@
                 <w:b/>
                 <w:sz w:val="22"/>
               </w:rPr>
-              <w:t>3.53</w:t>
+              <w:t>3.84</w:t>
             </w:r>
           </w:p>
         </w:tc>
@@ -1227,7 +1227,7 @@
                 <w:b/>
                 <w:sz w:val="22"/>
               </w:rPr>
-              <w:t>-7.14%</w:t>
+              <w:t>-5.3%</w:t>
             </w:r>
           </w:p>
         </w:tc>
@@ -1251,7 +1251,7 @@
           <w:i w:val="0"/>
           <w:sz w:val="24"/>
         </w:rPr>
-        <w:t>The strategy delivered markedly higher downside-risk-adjusted performance than either static allocation, holding maximum drawdown to roughly one-tenth of buy-and-hold - a direct consequence of spending most of the time (~58%) in cash and concentrating exposure (~15% average) in favorable regimes.</w:t>
+        <w:t>The strategy delivered markedly higher downside-risk-adjusted performance than either static allocation, holding maximum drawdown to roughly one-twelfth of buy-and-hold - a direct consequence of spending most of the time (~58%) in cash and concentrating exposure (~13% average) in favorable regimes. Every calendar year of the test window was positive. (Figures reflect the final June-2026 configuration: confidence scaling tightened and the accuracy de-risk rule retired after a 10-seed paired validation.)</w:t>
       </w:r>
     </w:p>
     <w:p>
@@ -1281,7 +1281,7 @@
           <w:i w:val="0"/>
           <w:sz w:val="24"/>
         </w:rPr>
-        <w:t>Early live (paper) evidence. In a strict out-of-sample window of the most recent year-to-date (105 days, 17 rebalances), the strategy returned +19.67% while Bitcoin buy-and-hold returned -14.36% and cash +4.09%.</w:t>
+        <w:t>Early live (paper) evidence. In a strict out-of-sample window covering the current year-to-date (through early June, 24 rebalances; model last trained in January), the strategy returned +9.3% in consistent BRL while Bitcoin buy-and-hold returned -33% in BRL and cash +5.9%.</w:t>
       </w:r>
     </w:p>
     <w:p>

</xml_diff>